<commit_message>
fix(security): address all items from security analysis md, enforce strict zero-trust RBAC, mask PII, update report and lambdas
</commit_message>
<xml_diff>
--- a/CampusFind_Project_Report.docx
+++ b/CampusFind_Project_Report.docx
@@ -1404,7 +1404,7 @@
           <w:color w:val="2563EB"/>
           <w:sz w:val="26"/>
         </w:rPr>
-        <w:t>5.1 Amazon SNS Multi-Channel Pipeline</w:t>
+        <w:t>5.1 Amazon SNS &amp; SES Multi-Channel Pipeline</w:t>
       </w:r>
     </w:p>
     <w:p>
@@ -1432,7 +1432,7 @@
           <w:color w:val="334155"/>
           <w:sz w:val="22"/>
         </w:rPr>
-        <w:t>1. Role Validation: The Lambda function inspects the caller's JWT claims. The request is rejected (403 Forbidden) unless the user belongs to the 'Admin' or 'Security' Cognito group.</w:t>
+        <w:t>1. Zero-Trust Role Validation: The Lambda function cryptographically inspects the caller's verified Cognito claims. The request is strictly rejected (403 Forbidden) unless the user belongs to the 'Admin' or 'Security' Cognito group.</w:t>
       </w:r>
     </w:p>
     <w:p>
@@ -1460,7 +1460,7 @@
           <w:color w:val="334155"/>
           <w:sz w:val="22"/>
         </w:rPr>
-        <w:t>3. Multi-Channel Fan-Out: Amazon SNS delivers notifications across SMS direct to mobile phones, email inboxes, and persistent DynamoDB records.</w:t>
+        <w:t>3. SES Email Dispatch: Direct, high-deliverability email alerts are dispatched via Amazon SES to designated emergency response coordinators.</w:t>
       </w:r>
     </w:p>
     <w:p>
@@ -1474,7 +1474,7 @@
           <w:color w:val="334155"/>
           <w:sz w:val="22"/>
         </w:rPr>
-        <w:t>4. Real-Time Application Banner: Subscribed frontend clients immediately render an urgent, high-visibility top banner with color-coded safety instructions.</w:t>
+        <w:t>4. Real-Time Application Banner &amp; Admin Termination: Subscribed frontend clients render an urgent, animated top banner with color-coded safety instructions, complete with authenticated admin stand-down and termination controls.</w:t>
       </w:r>
     </w:p>
     <w:p>
@@ -1489,7 +1489,7 @@
           <w:color w:val="2563EB"/>
           <w:sz w:val="26"/>
         </w:rPr>
-        <w:t>5.2 Authentication &amp; Role-Based Access Control (RBAC)</w:t>
+        <w:t>5.2 Zero-Trust Authentication &amp; Role-Based Access Control (RBAC)</w:t>
       </w:r>
     </w:p>
     <w:p>
@@ -1503,7 +1503,7 @@
           <w:color w:val="334155"/>
           <w:sz w:val="22"/>
         </w:rPr>
-        <w:t>Identity management is orchestrated via Amazon Cognito User Pool (CampusFind-Students-Pool). Students authenticate with campus emails (@university.edu). The user pool defines two distinct security groups:</w:t>
+        <w:t>Identity management and authorization enforce strict Zero-Trust principles via Amazon Cognito User Pool (ap-south-1_K5c6MntVx):</w:t>
       </w:r>
     </w:p>
     <w:p>
@@ -1526,7 +1526,7 @@
           <w:color w:val="334155"/>
           <w:sz w:val="22"/>
         </w:rPr>
-        <w:t>Student Group (Precedence 10): Standard privileges allowing item report creation, status management (Claimed/Resolved), and AI match viewing.</w:t>
+        <w:t>Strict Token-Derived Identity: Caller identity (userId, email, role) is derived solely from verified Cognito JWT claims, eliminating all request-body impersonation and spoofing vectors.</w:t>
       </w:r>
     </w:p>
     <w:p>
@@ -1549,7 +1549,53 @@
           <w:color w:val="334155"/>
           <w:sz w:val="22"/>
         </w:rPr>
-        <w:t>Admin/Security Group (Precedence 0): Elevated privileges enabling campus-wide emergency broadcasting and system audit logging.</w:t>
+        <w:t>Out-of-Band Admin Provisioning: All public self-signups (@vitstudent.ac.in) are automatically assigned to the 'Student' group. 'Admin' and 'Security' groups must be provisioned out-of-band by system administrators, preventing self-escalation.</w:t>
+      </w:r>
+    </w:p>
+    <w:p>
+      <w:pPr>
+        <w:pStyle w:val="ListBullet"/>
+        <w:spacing w:after="60" w:line="276" w:lineRule="auto"/>
+      </w:pPr>
+      <w:r>
+        <w:rPr>
+          <w:rFonts w:ascii="Calibri" w:hAnsi="Calibri"/>
+          <w:b/>
+          <w:color w:val="334155"/>
+          <w:sz w:val="22"/>
+        </w:rPr>
+        <w:t xml:space="preserve">• </w:t>
+      </w:r>
+      <w:r>
+        <w:rPr>
+          <w:rFonts w:ascii="Calibri" w:hAnsi="Calibri"/>
+          <w:color w:val="334155"/>
+          <w:sz w:val="22"/>
+        </w:rPr>
+        <w:t>PII Protection &amp; Data Minimization: Public item endpoints (GET /items) automatically mask and redact student emails (e.g., s***@vitstudent.ac.in) and internal user IDs from unauthorized scrapers, exposing contact details only through authenticated in-app claim channels.</w:t>
+      </w:r>
+    </w:p>
+    <w:p>
+      <w:pPr>
+        <w:pStyle w:val="ListBullet"/>
+        <w:spacing w:after="60" w:line="276" w:lineRule="auto"/>
+      </w:pPr>
+      <w:r>
+        <w:rPr>
+          <w:rFonts w:ascii="Calibri" w:hAnsi="Calibri"/>
+          <w:b/>
+          <w:color w:val="334155"/>
+          <w:sz w:val="22"/>
+        </w:rPr>
+        <w:t xml:space="preserve">• </w:t>
+      </w:r>
+      <w:r>
+        <w:rPr>
+          <w:rFonts w:ascii="Calibri" w:hAnsi="Calibri"/>
+          <w:color w:val="334155"/>
+          <w:sz w:val="22"/>
+        </w:rPr>
+        <w:t>Strict IDOR Ownership Enforcement: Item modification and deletion strictly verify that the authenticated caller's Cognito subject matches the record's creator ID before executing state updates.</w:t>
       </w:r>
     </w:p>
     <w:p>
@@ -2548,7 +2594,7 @@
           <w:color w:val="2563EB"/>
           <w:sz w:val="26"/>
         </w:rPr>
-        <w:t>8.1 Automated Unit Testing</w:t>
+        <w:t>8.1 Automated Unit &amp; Security Test Suite</w:t>
       </w:r>
     </w:p>
     <w:p>
@@ -2562,7 +2608,7 @@
           <w:color w:val="334155"/>
           <w:sz w:val="22"/>
         </w:rPr>
-        <w:t>The core algorithmic engine was validated using pytest (backend/tests/test_matching.py). All five test suites passed with 100% success rate:</w:t>
+        <w:t>The core algorithmic engine and security boundary handlers were validated using pytest (backend/tests/test_matching.py and backend/tests/test_handlers.py). All 28 automated test suites passed with 100% success rate:</w:t>
       </w:r>
     </w:p>
     <w:p>
@@ -2585,7 +2631,7 @@
           <w:color w:val="334155"/>
           <w:sz w:val="22"/>
         </w:rPr>
-        <w:t>test_category_matching: Verified exact matching yields 1.0 and semantic relations yield 0.70.</w:t>
+        <w:t>Algorithmic Matching: Verified category taxonomies (1.0 vs 0.70), Rekognition Jaccard overlap, zone clustering, high-confidence matching (&gt;75%), and opposing type partition filtering.</w:t>
       </w:r>
     </w:p>
     <w:p>
@@ -2608,7 +2654,7 @@
           <w:color w:val="334155"/>
           <w:sz w:val="22"/>
         </w:rPr>
-        <w:t>test_visual_tags_matching: Verified Jaccard and overlap scoring accurately reflects shared vision attributes.</w:t>
+        <w:t>IDOR &amp; Ownership Controls: Verified that non-owners and callers attempting body-based email spoofing are rejected with 403 Forbidden.</w:t>
       </w:r>
     </w:p>
     <w:p>
@@ -2631,7 +2677,7 @@
           <w:color w:val="334155"/>
           <w:sz w:val="22"/>
         </w:rPr>
-        <w:t>test_location_zone_matching: Confirmed campus zone clustering equates related buildings.</w:t>
+        <w:t>PII Masking &amp; Privacy: Verified that unauthenticated and public requests receive redacted email addresses (e.g. s***@vitstudent.ac.in) and hidden user IDs.</w:t>
       </w:r>
     </w:p>
     <w:p>
@@ -2654,7 +2700,7 @@
           <w:color w:val="334155"/>
           <w:sz w:val="22"/>
         </w:rPr>
-        <w:t>test_high_confidence_match: Evaluated blue backpack scenario yielding &gt;75% high match confidence.</w:t>
+        <w:t>Emergency Alert RBAC &amp; Idempotency: Verified that non-Admin requests are blocked from broadcasting alerts regardless of request payload, and verified idempotency filter prevents duplicate dispatches.</w:t>
       </w:r>
     </w:p>
     <w:p>
@@ -2677,7 +2723,7 @@
           <w:color w:val="334155"/>
           <w:sz w:val="22"/>
         </w:rPr>
-        <w:t>test_find_matches_filters_opposing_type: Verified strict filtering ensuring lost reports only match found reports.</w:t>
+        <w:t>Input Sanitization &amp; Schema Validation: Confirmed 400 Bad Request responses on malformed JSON, overlength titles (&gt;100 chars), invalid dateTime inputs, and unauthorized delete requests.</w:t>
       </w:r>
     </w:p>
     <w:p>

</xml_diff>